<commit_message>
docs: relatorios de cobertura de QA e status dos PRs (20/08/2026)
- Atualiza relatorio-cobertura-qa-front-end com as 4 QAs concluidas
  nesta sessao (Funcionarios, Agendamentos, Resetar Senha, Registrar)
  e os 15 bugs corrigidos
- Adiciona relatorio-prs-pendentes documentando os 9 PRs abertos e
  mergeados em develop nos tres repositorios do ecossistema
</commit_message>
<xml_diff>
--- a/docs/prd/cobertura-qa/relatorio-cobertura-qa-front-end-2026-08-19.docx
+++ b/docs/prd/cobertura-qa/relatorio-cobertura-qa-front-end-2026-08-19.docx
@@ -25,7 +25,7 @@
           <w:color w:val="64748B"/>
           <w:sz w:val="22"/>
         </w:rPr>
-        <w:t>sgsm-front-medico  ·  Skill executa-testes-funcionais-qa-front-end  ·  19/08/2026</w:t>
+        <w:t>sgsm-front-medico  ·  Skill executa-testes-funcionais-qa-front-end  ·  atualizado em 20/08/2026</w:t>
       </w:r>
     </w:p>
     <w:p>
@@ -42,6 +42,19 @@
     </w:p>
     <w:p>
       <w:pPr>
+        <w:spacing w:before="80" w:after="200"/>
+      </w:pPr>
+      <w:r>
+        <w:rPr>
+          <w:i/>
+          <w:color w:val="15803D"/>
+          <w:sz w:val="20"/>
+        </w:rPr>
+        <w:t>Atualização de 20/08/2026: mais 4 telas passaram por QA funcional completa desde a versão anterior deste relatório (Funcionários, Agendamentos, Esqueci/Resetar Senha, Registrar) — 15 bugs novos encontrados e corrigidos, todos retestados ao vivo e mergeados em develop.</w:t>
+      </w:r>
+    </w:p>
+    <w:p>
+      <w:pPr>
         <w:spacing w:before="400" w:after="160"/>
         <w:pBdr>
           <w:bottom w:val="single" w:sz="6" w:space="4" w:color="1a56db"/>
@@ -53,7 +66,7 @@
           <w:color w:val="1A56DB"/>
           <w:sz w:val="30"/>
         </w:rPr>
-        <w:t>Casos de uso testados</w:t>
+        <w:t>Casos de uso testados (9 telas)</w:t>
       </w:r>
     </w:p>
     <w:tbl>
@@ -73,7 +86,7 @@
       <w:tr>
         <w:tc>
           <w:tcPr>
-            <w:tcW w:type="dxa" w:w="1814"/>
+            <w:tcW w:type="dxa" w:w="1587"/>
             <w:shd w:val="clear" w:fill="1a56db"/>
           </w:tcPr>
           <w:p>
@@ -93,7 +106,7 @@
         </w:tc>
         <w:tc>
           <w:tcPr>
-            <w:tcW w:type="dxa" w:w="1871"/>
+            <w:tcW w:type="dxa" w:w="1701"/>
             <w:shd w:val="clear" w:fill="1a56db"/>
           </w:tcPr>
           <w:p>
@@ -153,7 +166,7 @@
         </w:tc>
         <w:tc>
           <w:tcPr>
-            <w:tcW w:type="dxa" w:w="1814"/>
+            <w:tcW w:type="dxa" w:w="2211"/>
             <w:shd w:val="clear" w:fill="1a56db"/>
           </w:tcPr>
           <w:p>
@@ -175,7 +188,7 @@
       <w:tr>
         <w:tc>
           <w:tcPr>
-            <w:tcW w:type="dxa" w:w="1814"/>
+            <w:tcW w:type="dxa" w:w="1587"/>
           </w:tcPr>
           <w:p>
             <w:r/>
@@ -190,7 +203,7 @@
         </w:tc>
         <w:tc>
           <w:tcPr>
-            <w:tcW w:type="dxa" w:w="1871"/>
+            <w:tcW w:type="dxa" w:w="1701"/>
           </w:tcPr>
           <w:p>
             <w:r/>
@@ -239,7 +252,7 @@
         </w:tc>
         <w:tc>
           <w:tcPr>
-            <w:tcW w:type="dxa" w:w="1814"/>
+            <w:tcW w:type="dxa" w:w="2211"/>
           </w:tcPr>
           <w:p>
             <w:r/>
@@ -256,7 +269,7 @@
       <w:tr>
         <w:tc>
           <w:tcPr>
-            <w:tcW w:type="dxa" w:w="1814"/>
+            <w:tcW w:type="dxa" w:w="1587"/>
             <w:shd w:val="clear" w:fill="f1f5f9"/>
           </w:tcPr>
           <w:p>
@@ -272,7 +285,7 @@
         </w:tc>
         <w:tc>
           <w:tcPr>
-            <w:tcW w:type="dxa" w:w="1871"/>
+            <w:tcW w:type="dxa" w:w="1701"/>
             <w:shd w:val="clear" w:fill="f1f5f9"/>
           </w:tcPr>
           <w:p>
@@ -324,7 +337,7 @@
         </w:tc>
         <w:tc>
           <w:tcPr>
-            <w:tcW w:type="dxa" w:w="1814"/>
+            <w:tcW w:type="dxa" w:w="2211"/>
             <w:shd w:val="clear" w:fill="f1f5f9"/>
           </w:tcPr>
           <w:p>
@@ -344,7 +357,7 @@
       <w:tr>
         <w:tc>
           <w:tcPr>
-            <w:tcW w:type="dxa" w:w="1814"/>
+            <w:tcW w:type="dxa" w:w="1587"/>
           </w:tcPr>
           <w:p>
             <w:r/>
@@ -359,7 +372,7 @@
         </w:tc>
         <w:tc>
           <w:tcPr>
-            <w:tcW w:type="dxa" w:w="1871"/>
+            <w:tcW w:type="dxa" w:w="1701"/>
           </w:tcPr>
           <w:p>
             <w:r/>
@@ -406,7 +419,7 @@
         </w:tc>
         <w:tc>
           <w:tcPr>
-            <w:tcW w:type="dxa" w:w="1814"/>
+            <w:tcW w:type="dxa" w:w="2211"/>
           </w:tcPr>
           <w:p>
             <w:r/>
@@ -423,7 +436,7 @@
       <w:tr>
         <w:tc>
           <w:tcPr>
-            <w:tcW w:type="dxa" w:w="1814"/>
+            <w:tcW w:type="dxa" w:w="1587"/>
             <w:shd w:val="clear" w:fill="f1f5f9"/>
           </w:tcPr>
           <w:p>
@@ -439,7 +452,7 @@
         </w:tc>
         <w:tc>
           <w:tcPr>
-            <w:tcW w:type="dxa" w:w="1871"/>
+            <w:tcW w:type="dxa" w:w="1701"/>
             <w:shd w:val="clear" w:fill="f1f5f9"/>
           </w:tcPr>
           <w:p>
@@ -487,7 +500,7 @@
         </w:tc>
         <w:tc>
           <w:tcPr>
-            <w:tcW w:type="dxa" w:w="1814"/>
+            <w:tcW w:type="dxa" w:w="2211"/>
             <w:shd w:val="clear" w:fill="f1f5f9"/>
           </w:tcPr>
           <w:p>
@@ -505,7 +518,7 @@
       <w:tr>
         <w:tc>
           <w:tcPr>
-            <w:tcW w:type="dxa" w:w="1814"/>
+            <w:tcW w:type="dxa" w:w="1587"/>
           </w:tcPr>
           <w:p>
             <w:r/>
@@ -520,7 +533,7 @@
         </w:tc>
         <w:tc>
           <w:tcPr>
-            <w:tcW w:type="dxa" w:w="1871"/>
+            <w:tcW w:type="dxa" w:w="1701"/>
           </w:tcPr>
           <w:p>
             <w:r/>
@@ -569,7 +582,7 @@
         </w:tc>
         <w:tc>
           <w:tcPr>
-            <w:tcW w:type="dxa" w:w="1814"/>
+            <w:tcW w:type="dxa" w:w="2211"/>
           </w:tcPr>
           <w:p>
             <w:r/>
@@ -579,6 +592,360 @@
                 <w:sz w:val="19"/>
               </w:rPr>
               <w:t>#19 (mergiado)</w:t>
+            </w:r>
+          </w:p>
+        </w:tc>
+      </w:tr>
+      <w:tr>
+        <w:tc>
+          <w:tcPr>
+            <w:tcW w:type="dxa" w:w="1587"/>
+            <w:shd w:val="clear" w:fill="f1f5f9"/>
+          </w:tcPr>
+          <w:p>
+            <w:r/>
+            <w:r>
+              <w:rPr>
+                <w:color w:val="1E293B"/>
+                <w:sz w:val="19"/>
+              </w:rPr>
+              <w:t>/funcionarios</w:t>
+            </w:r>
+          </w:p>
+        </w:tc>
+        <w:tc>
+          <w:tcPr>
+            <w:tcW w:type="dxa" w:w="1701"/>
+            <w:shd w:val="clear" w:fill="f1f5f9"/>
+          </w:tcPr>
+          <w:p>
+            <w:r/>
+            <w:r>
+              <w:rPr>
+                <w:color w:val="1E293B"/>
+                <w:sz w:val="19"/>
+              </w:rPr>
+              <w:t>qa/funcionarios</w:t>
+            </w:r>
+          </w:p>
+        </w:tc>
+        <w:tc>
+          <w:tcPr>
+            <w:tcW w:type="dxa" w:w="2438"/>
+            <w:shd w:val="clear" w:fill="f1f5f9"/>
+          </w:tcPr>
+          <w:p>
+            <w:r/>
+            <w:r>
+              <w:rPr>
+                <w:color w:val="1E293B"/>
+                <w:sz w:val="19"/>
+              </w:rPr>
+              <w:t>70 (65 aprovados, 1 parcial,</w:t>
+              <w:br/>
+              <w:t>4 bloqueados por falta</w:t>
+              <w:br/>
+              <w:t>de credencial)</w:t>
+            </w:r>
+          </w:p>
+        </w:tc>
+        <w:tc>
+          <w:tcPr>
+            <w:tcW w:type="dxa" w:w="1701"/>
+            <w:shd w:val="clear" w:fill="f1f5f9"/>
+          </w:tcPr>
+          <w:p>
+            <w:r/>
+            <w:r>
+              <w:rPr>
+                <w:color w:val="1E293B"/>
+                <w:sz w:val="19"/>
+              </w:rPr>
+              <w:t>Aprovado, 5 bugs</w:t>
+              <w:br/>
+              <w:t>corrigidos</w:t>
+            </w:r>
+          </w:p>
+        </w:tc>
+        <w:tc>
+          <w:tcPr>
+            <w:tcW w:type="dxa" w:w="2211"/>
+            <w:shd w:val="clear" w:fill="f1f5f9"/>
+          </w:tcPr>
+          <w:p>
+            <w:r/>
+            <w:r>
+              <w:rPr>
+                <w:color w:val="1E293B"/>
+                <w:sz w:val="19"/>
+              </w:rPr>
+              <w:t>front #20 + sgsm #14</w:t>
+              <w:br/>
+              <w:t>(mergiados)</w:t>
+            </w:r>
+          </w:p>
+        </w:tc>
+      </w:tr>
+      <w:tr>
+        <w:tc>
+          <w:tcPr>
+            <w:tcW w:type="dxa" w:w="1587"/>
+          </w:tcPr>
+          <w:p>
+            <w:r/>
+            <w:r>
+              <w:rPr>
+                <w:color w:val="1E293B"/>
+                <w:sz w:val="19"/>
+              </w:rPr>
+              <w:t>/agendamentos</w:t>
+            </w:r>
+          </w:p>
+        </w:tc>
+        <w:tc>
+          <w:tcPr>
+            <w:tcW w:type="dxa" w:w="1701"/>
+          </w:tcPr>
+          <w:p>
+            <w:r/>
+            <w:r>
+              <w:rPr>
+                <w:color w:val="1E293B"/>
+                <w:sz w:val="19"/>
+              </w:rPr>
+              <w:t>qa/agendamentos</w:t>
+            </w:r>
+          </w:p>
+        </w:tc>
+        <w:tc>
+          <w:tcPr>
+            <w:tcW w:type="dxa" w:w="2438"/>
+          </w:tcPr>
+          <w:p>
+            <w:r/>
+            <w:r>
+              <w:rPr>
+                <w:color w:val="1E293B"/>
+                <w:sz w:val="19"/>
+              </w:rPr>
+              <w:t>75 (62 aprovados, 2 parciais,</w:t>
+              <w:br/>
+              <w:t>5 bloqueados por limitação</w:t>
+              <w:br/>
+              <w:t>de ambiente)</w:t>
+            </w:r>
+          </w:p>
+        </w:tc>
+        <w:tc>
+          <w:tcPr>
+            <w:tcW w:type="dxa" w:w="1701"/>
+          </w:tcPr>
+          <w:p>
+            <w:r/>
+            <w:r>
+              <w:rPr>
+                <w:color w:val="1E293B"/>
+                <w:sz w:val="19"/>
+              </w:rPr>
+              <w:t>Aprovado, 6 bugs</w:t>
+              <w:br/>
+              <w:t>corrigidos</w:t>
+            </w:r>
+          </w:p>
+        </w:tc>
+        <w:tc>
+          <w:tcPr>
+            <w:tcW w:type="dxa" w:w="2211"/>
+          </w:tcPr>
+          <w:p>
+            <w:r/>
+            <w:r>
+              <w:rPr>
+                <w:color w:val="1E293B"/>
+                <w:sz w:val="19"/>
+              </w:rPr>
+              <w:t>front #21 + sgsm #15</w:t>
+              <w:br/>
+              <w:t>(mergiados)</w:t>
+            </w:r>
+          </w:p>
+        </w:tc>
+      </w:tr>
+      <w:tr>
+        <w:tc>
+          <w:tcPr>
+            <w:tcW w:type="dxa" w:w="1587"/>
+            <w:shd w:val="clear" w:fill="f1f5f9"/>
+          </w:tcPr>
+          <w:p>
+            <w:r/>
+            <w:r>
+              <w:rPr>
+                <w:color w:val="1E293B"/>
+                <w:sz w:val="19"/>
+              </w:rPr>
+              <w:t>/esqueci-senha</w:t>
+              <w:br/>
+              <w:t>/resetar-senha</w:t>
+            </w:r>
+          </w:p>
+        </w:tc>
+        <w:tc>
+          <w:tcPr>
+            <w:tcW w:type="dxa" w:w="1701"/>
+            <w:shd w:val="clear" w:fill="f1f5f9"/>
+          </w:tcPr>
+          <w:p>
+            <w:r/>
+            <w:r>
+              <w:rPr>
+                <w:color w:val="1E293B"/>
+                <w:sz w:val="19"/>
+              </w:rPr>
+              <w:t>qa/resetar-senha</w:t>
+            </w:r>
+          </w:p>
+        </w:tc>
+        <w:tc>
+          <w:tcPr>
+            <w:tcW w:type="dxa" w:w="2438"/>
+            <w:shd w:val="clear" w:fill="f1f5f9"/>
+          </w:tcPr>
+          <w:p>
+            <w:r/>
+            <w:r>
+              <w:rPr>
+                <w:color w:val="1E293B"/>
+                <w:sz w:val="19"/>
+              </w:rPr>
+              <w:t>26 (22 aprovados, 1 parcial,</w:t>
+              <w:br/>
+              <w:t>1 bloqueado, 1 não-testável</w:t>
+              <w:br/>
+              <w:t>por escopo de tempo)</w:t>
+            </w:r>
+          </w:p>
+        </w:tc>
+        <w:tc>
+          <w:tcPr>
+            <w:tcW w:type="dxa" w:w="1701"/>
+            <w:shd w:val="clear" w:fill="f1f5f9"/>
+          </w:tcPr>
+          <w:p>
+            <w:r/>
+            <w:r>
+              <w:rPr>
+                <w:color w:val="1E293B"/>
+                <w:sz w:val="19"/>
+              </w:rPr>
+              <w:t>Aprovado, 2 bugs</w:t>
+              <w:br/>
+              <w:t>corrigidos</w:t>
+            </w:r>
+          </w:p>
+        </w:tc>
+        <w:tc>
+          <w:tcPr>
+            <w:tcW w:type="dxa" w:w="2211"/>
+            <w:shd w:val="clear" w:fill="f1f5f9"/>
+          </w:tcPr>
+          <w:p>
+            <w:r/>
+            <w:r>
+              <w:rPr>
+                <w:color w:val="1E293B"/>
+                <w:sz w:val="19"/>
+              </w:rPr>
+              <w:t>front #22 + ms-sboot-auth #8</w:t>
+              <w:br/>
+              <w:t>(mergiados)</w:t>
+            </w:r>
+          </w:p>
+        </w:tc>
+      </w:tr>
+      <w:tr>
+        <w:tc>
+          <w:tcPr>
+            <w:tcW w:type="dxa" w:w="1587"/>
+          </w:tcPr>
+          <w:p>
+            <w:r/>
+            <w:r>
+              <w:rPr>
+                <w:color w:val="1E293B"/>
+                <w:sz w:val="19"/>
+              </w:rPr>
+              <w:t>/registrar</w:t>
+            </w:r>
+          </w:p>
+        </w:tc>
+        <w:tc>
+          <w:tcPr>
+            <w:tcW w:type="dxa" w:w="1701"/>
+          </w:tcPr>
+          <w:p>
+            <w:r/>
+            <w:r>
+              <w:rPr>
+                <w:color w:val="1E293B"/>
+                <w:sz w:val="19"/>
+              </w:rPr>
+              <w:t>qa/registrar</w:t>
+            </w:r>
+          </w:p>
+        </w:tc>
+        <w:tc>
+          <w:tcPr>
+            <w:tcW w:type="dxa" w:w="2438"/>
+          </w:tcPr>
+          <w:p>
+            <w:r/>
+            <w:r>
+              <w:rPr>
+                <w:color w:val="1E293B"/>
+                <w:sz w:val="19"/>
+              </w:rPr>
+              <w:t>35 (30 aprovados, 4 bugs</w:t>
+              <w:br/>
+              <w:t>corrigidos, 1 hipótese</w:t>
+              <w:br/>
+              <w:t>refutada por evidência)</w:t>
+            </w:r>
+          </w:p>
+        </w:tc>
+        <w:tc>
+          <w:tcPr>
+            <w:tcW w:type="dxa" w:w="1701"/>
+          </w:tcPr>
+          <w:p>
+            <w:r/>
+            <w:r>
+              <w:rPr>
+                <w:color w:val="1E293B"/>
+                <w:sz w:val="19"/>
+              </w:rPr>
+              <w:t>Aprovado, 4 bugs</w:t>
+              <w:br/>
+              <w:t>corrigidos</w:t>
+            </w:r>
+          </w:p>
+        </w:tc>
+        <w:tc>
+          <w:tcPr>
+            <w:tcW w:type="dxa" w:w="2211"/>
+          </w:tcPr>
+          <w:p>
+            <w:r/>
+            <w:r>
+              <w:rPr>
+                <w:color w:val="1E293B"/>
+                <w:sz w:val="19"/>
+              </w:rPr>
+              <w:t>front #23 + sgsm #16</w:t>
+              <w:br/>
+              <w:t>+ ms-sboot-auth #9</w:t>
+              <w:br/>
+              <w:t>(mergiados)</w:t>
             </w:r>
           </w:p>
         </w:tc>
@@ -615,7 +982,7 @@
           <w:color w:val="1A56DB"/>
           <w:sz w:val="30"/>
         </w:rPr>
-        <w:t>Casos de uso faltando</w:t>
+        <w:t>Casos de uso faltando (4 telas)</w:t>
       </w:r>
     </w:p>
     <w:tbl>
@@ -831,7 +1198,7 @@
                 <w:color w:val="1E293B"/>
                 <w:sz w:val="19"/>
               </w:rPr>
-              <w:t>Porta de entrada do sistema — nunca testada</w:t>
+              <w:t>Porta de entrada do sistema — nunca testada; agora é o maior risco, já que /registrar e /resetar-senha (fluxos vizinhos) já foram cobertos</w:t>
             </w:r>
           </w:p>
         </w:tc>
@@ -849,7 +1216,7 @@
                 <w:color w:val="1E293B"/>
                 <w:sz w:val="19"/>
               </w:rPr>
-              <w:t>/registrar</w:t>
+              <w:t>/ia</w:t>
             </w:r>
           </w:p>
         </w:tc>
@@ -865,7 +1232,7 @@
                 <w:color w:val="1E293B"/>
                 <w:sz w:val="19"/>
               </w:rPr>
-              <w:t>RegisterPage</w:t>
+              <w:t>IaPage</w:t>
             </w:r>
           </w:p>
         </w:tc>
@@ -873,247 +1240,6 @@
           <w:tcPr>
             <w:tcW w:type="dxa" w:w="5669"/>
             <w:shd w:val="clear" w:fill="f1f5f9"/>
-          </w:tcPr>
-          <w:p>
-            <w:r/>
-            <w:r>
-              <w:rPr>
-                <w:color w:val="1E293B"/>
-                <w:sz w:val="19"/>
-              </w:rPr>
-              <w:t>Fluxo de autocadastro — nunca testado</w:t>
-            </w:r>
-          </w:p>
-        </w:tc>
-      </w:tr>
-      <w:tr>
-        <w:tc>
-          <w:tcPr>
-            <w:tcW w:type="dxa" w:w="1928"/>
-          </w:tcPr>
-          <w:p>
-            <w:r/>
-            <w:r>
-              <w:rPr>
-                <w:color w:val="1E293B"/>
-                <w:sz w:val="19"/>
-              </w:rPr>
-              <w:t>/esqueci-senha</w:t>
-            </w:r>
-          </w:p>
-        </w:tc>
-        <w:tc>
-          <w:tcPr>
-            <w:tcW w:type="dxa" w:w="2041"/>
-          </w:tcPr>
-          <w:p>
-            <w:r/>
-            <w:r>
-              <w:rPr>
-                <w:color w:val="1E293B"/>
-                <w:sz w:val="19"/>
-              </w:rPr>
-              <w:t>EsqueciSenhaPage</w:t>
-            </w:r>
-          </w:p>
-        </w:tc>
-        <w:tc>
-          <w:tcPr>
-            <w:tcW w:type="dxa" w:w="5669"/>
-          </w:tcPr>
-          <w:p>
-            <w:r/>
-            <w:r>
-              <w:rPr>
-                <w:color w:val="1E293B"/>
-                <w:sz w:val="19"/>
-              </w:rPr>
-              <w:t>Fluxo de recuperação de senha — nunca testado</w:t>
-            </w:r>
-          </w:p>
-        </w:tc>
-      </w:tr>
-      <w:tr>
-        <w:tc>
-          <w:tcPr>
-            <w:tcW w:type="dxa" w:w="1928"/>
-            <w:shd w:val="clear" w:fill="f1f5f9"/>
-          </w:tcPr>
-          <w:p>
-            <w:r/>
-            <w:r>
-              <w:rPr>
-                <w:color w:val="1E293B"/>
-                <w:sz w:val="19"/>
-              </w:rPr>
-              <w:t>/resetar-senha</w:t>
-            </w:r>
-          </w:p>
-        </w:tc>
-        <w:tc>
-          <w:tcPr>
-            <w:tcW w:type="dxa" w:w="2041"/>
-            <w:shd w:val="clear" w:fill="f1f5f9"/>
-          </w:tcPr>
-          <w:p>
-            <w:r/>
-            <w:r>
-              <w:rPr>
-                <w:color w:val="1E293B"/>
-                <w:sz w:val="19"/>
-              </w:rPr>
-              <w:t>ResetarSenhaPage</w:t>
-            </w:r>
-          </w:p>
-        </w:tc>
-        <w:tc>
-          <w:tcPr>
-            <w:tcW w:type="dxa" w:w="5669"/>
-            <w:shd w:val="clear" w:fill="f1f5f9"/>
-          </w:tcPr>
-          <w:p>
-            <w:r/>
-            <w:r>
-              <w:rPr>
-                <w:color w:val="1E293B"/>
-                <w:sz w:val="19"/>
-              </w:rPr>
-              <w:t>Fluxo de recuperação de senha — nunca testado</w:t>
-            </w:r>
-          </w:p>
-        </w:tc>
-      </w:tr>
-      <w:tr>
-        <w:tc>
-          <w:tcPr>
-            <w:tcW w:type="dxa" w:w="1928"/>
-          </w:tcPr>
-          <w:p>
-            <w:r/>
-            <w:r>
-              <w:rPr>
-                <w:color w:val="1E293B"/>
-                <w:sz w:val="19"/>
-              </w:rPr>
-              <w:t>/agendamentos</w:t>
-            </w:r>
-          </w:p>
-        </w:tc>
-        <w:tc>
-          <w:tcPr>
-            <w:tcW w:type="dxa" w:w="2041"/>
-          </w:tcPr>
-          <w:p>
-            <w:r/>
-            <w:r>
-              <w:rPr>
-                <w:color w:val="1E293B"/>
-                <w:sz w:val="19"/>
-              </w:rPr>
-              <w:t>AgendamentosPage</w:t>
-            </w:r>
-          </w:p>
-        </w:tc>
-        <w:tc>
-          <w:tcPr>
-            <w:tcW w:type="dxa" w:w="5669"/>
-          </w:tcPr>
-          <w:p>
-            <w:r/>
-            <w:r>
-              <w:rPr>
-                <w:color w:val="1E293B"/>
-                <w:sz w:val="19"/>
-              </w:rPr>
-              <w:t>Agenda médica, horários e conflitos — sem cobertura</w:t>
-            </w:r>
-          </w:p>
-        </w:tc>
-      </w:tr>
-      <w:tr>
-        <w:tc>
-          <w:tcPr>
-            <w:tcW w:type="dxa" w:w="1928"/>
-            <w:shd w:val="clear" w:fill="f1f5f9"/>
-          </w:tcPr>
-          <w:p>
-            <w:r/>
-            <w:r>
-              <w:rPr>
-                <w:color w:val="1E293B"/>
-                <w:sz w:val="19"/>
-              </w:rPr>
-              <w:t>/funcionarios</w:t>
-            </w:r>
-          </w:p>
-        </w:tc>
-        <w:tc>
-          <w:tcPr>
-            <w:tcW w:type="dxa" w:w="2041"/>
-            <w:shd w:val="clear" w:fill="f1f5f9"/>
-          </w:tcPr>
-          <w:p>
-            <w:r/>
-            <w:r>
-              <w:rPr>
-                <w:color w:val="1E293B"/>
-                <w:sz w:val="19"/>
-              </w:rPr>
-              <w:t>FuncionariosPage</w:t>
-            </w:r>
-          </w:p>
-        </w:tc>
-        <w:tc>
-          <w:tcPr>
-            <w:tcW w:type="dxa" w:w="5669"/>
-            <w:shd w:val="clear" w:fill="f1f5f9"/>
-          </w:tcPr>
-          <w:p>
-            <w:r/>
-            <w:r>
-              <w:rPr>
-                <w:color w:val="1E293B"/>
-                <w:sz w:val="19"/>
-              </w:rPr>
-              <w:t>Sem cobertura</w:t>
-            </w:r>
-          </w:p>
-        </w:tc>
-      </w:tr>
-      <w:tr>
-        <w:tc>
-          <w:tcPr>
-            <w:tcW w:type="dxa" w:w="1928"/>
-          </w:tcPr>
-          <w:p>
-            <w:r/>
-            <w:r>
-              <w:rPr>
-                <w:color w:val="1E293B"/>
-                <w:sz w:val="19"/>
-              </w:rPr>
-              <w:t>/ia</w:t>
-            </w:r>
-          </w:p>
-        </w:tc>
-        <w:tc>
-          <w:tcPr>
-            <w:tcW w:type="dxa" w:w="2041"/>
-          </w:tcPr>
-          <w:p>
-            <w:r/>
-            <w:r>
-              <w:rPr>
-                <w:color w:val="1E293B"/>
-                <w:sz w:val="19"/>
-              </w:rPr>
-              <w:t>IaPage</w:t>
-            </w:r>
-          </w:p>
-        </w:tc>
-        <w:tc>
-          <w:tcPr>
-            <w:tcW w:type="dxa" w:w="5669"/>
           </w:tcPr>
           <w:p>
             <w:r/>
@@ -1504,6 +1630,418 @@
           <w:color w:val="1A56DB"/>
           <w:sz w:val="30"/>
         </w:rPr>
+        <w:t>Bugs encontrados e corrigidos — rodada de 20/08/2026</w:t>
+      </w:r>
+    </w:p>
+    <w:p>
+      <w:pPr>
+        <w:spacing w:after="160"/>
+      </w:pPr>
+      <w:r>
+        <w:rPr>
+          <w:color w:val="1E293B"/>
+          <w:sz w:val="21"/>
+        </w:rPr>
+        <w:t>Os 15 bugs abaixo foram encontrados nas 4 QAs mais recentes, todos corrigidos, retestados ao vivo com evidência fresca confirmando a correção, e mergeados em develop nos repositórios correspondentes (ver relatorio-prs-pendentes-2026-08-20.docx para o detalhe de cada PR).</w:t>
+      </w:r>
+    </w:p>
+    <w:tbl>
+      <w:tblPr>
+        <w:tblW w:type="auto" w:w="0"/>
+        <w:jc w:val="center"/>
+        <w:tblLayout w:type="autofit"/>
+        <w:tblLook w:firstColumn="1" w:firstRow="1" w:lastColumn="0" w:lastRow="0" w:noHBand="0" w:noVBand="1" w:val="04A0"/>
+      </w:tblPr>
+      <w:tblGrid>
+        <w:gridCol w:w="2351"/>
+        <w:gridCol w:w="2351"/>
+        <w:gridCol w:w="2351"/>
+        <w:gridCol w:w="2351"/>
+      </w:tblGrid>
+      <w:tr>
+        <w:tc>
+          <w:tcPr>
+            <w:tcW w:type="dxa" w:w="1701"/>
+            <w:shd w:val="clear" w:fill="1a56db"/>
+          </w:tcPr>
+          <w:p>
+            <w:pPr>
+              <w:jc w:val="left"/>
+            </w:pPr>
+            <w:r/>
+            <w:r>
+              <w:rPr>
+                <w:b/>
+                <w:color w:val="FFFFFF"/>
+                <w:sz w:val="19"/>
+              </w:rPr>
+              <w:t>Módulo</w:t>
+            </w:r>
+          </w:p>
+        </w:tc>
+        <w:tc>
+          <w:tcPr>
+            <w:tcW w:type="dxa" w:w="850"/>
+            <w:shd w:val="clear" w:fill="1a56db"/>
+          </w:tcPr>
+          <w:p>
+            <w:pPr>
+              <w:jc w:val="left"/>
+            </w:pPr>
+            <w:r/>
+            <w:r>
+              <w:rPr>
+                <w:b/>
+                <w:color w:val="FFFFFF"/>
+                <w:sz w:val="19"/>
+              </w:rPr>
+              <w:t>Bugs</w:t>
+            </w:r>
+          </w:p>
+        </w:tc>
+        <w:tc>
+          <w:tcPr>
+            <w:tcW w:type="dxa" w:w="4819"/>
+            <w:shd w:val="clear" w:fill="1a56db"/>
+          </w:tcPr>
+          <w:p>
+            <w:pPr>
+              <w:jc w:val="left"/>
+            </w:pPr>
+            <w:r/>
+            <w:r>
+              <w:rPr>
+                <w:b/>
+                <w:color w:val="FFFFFF"/>
+                <w:sz w:val="19"/>
+              </w:rPr>
+              <w:t>Achado de maior severidade</w:t>
+            </w:r>
+          </w:p>
+        </w:tc>
+        <w:tc>
+          <w:tcPr>
+            <w:tcW w:type="dxa" w:w="2268"/>
+            <w:shd w:val="clear" w:fill="1a56db"/>
+          </w:tcPr>
+          <w:p>
+            <w:pPr>
+              <w:jc w:val="left"/>
+            </w:pPr>
+            <w:r/>
+            <w:r>
+              <w:rPr>
+                <w:b/>
+                <w:color w:val="FFFFFF"/>
+                <w:sz w:val="19"/>
+              </w:rPr>
+              <w:t>Repositório(s) corrigido(s)</w:t>
+            </w:r>
+          </w:p>
+        </w:tc>
+      </w:tr>
+      <w:tr>
+        <w:tc>
+          <w:tcPr>
+            <w:tcW w:type="dxa" w:w="1701"/>
+          </w:tcPr>
+          <w:p>
+            <w:r/>
+            <w:r>
+              <w:rPr>
+                <w:color w:val="1E293B"/>
+                <w:sz w:val="19"/>
+              </w:rPr>
+              <w:t>Funcionários</w:t>
+            </w:r>
+          </w:p>
+        </w:tc>
+        <w:tc>
+          <w:tcPr>
+            <w:tcW w:type="dxa" w:w="850"/>
+          </w:tcPr>
+          <w:p>
+            <w:r/>
+            <w:r>
+              <w:rPr>
+                <w:color w:val="1E293B"/>
+                <w:sz w:val="19"/>
+              </w:rPr>
+              <w:t>5</w:t>
+            </w:r>
+          </w:p>
+        </w:tc>
+        <w:tc>
+          <w:tcPr>
+            <w:tcW w:type="dxa" w:w="4819"/>
+          </w:tcPr>
+          <w:p>
+            <w:r/>
+            <w:r>
+              <w:rPr>
+                <w:color w:val="1E293B"/>
+                <w:sz w:val="19"/>
+              </w:rPr>
+              <w:t>E-mail duplicado aceito no cadastro (sem checagem</w:t>
+              <w:br/>
+              <w:t>de unicidade, ao contrário da edição)</w:t>
+            </w:r>
+          </w:p>
+        </w:tc>
+        <w:tc>
+          <w:tcPr>
+            <w:tcW w:type="dxa" w:w="2268"/>
+          </w:tcPr>
+          <w:p>
+            <w:r/>
+            <w:r>
+              <w:rPr>
+                <w:color w:val="1E293B"/>
+                <w:sz w:val="19"/>
+              </w:rPr>
+              <w:t>sgsm + sgsm-front-medico</w:t>
+            </w:r>
+          </w:p>
+        </w:tc>
+      </w:tr>
+      <w:tr>
+        <w:tc>
+          <w:tcPr>
+            <w:tcW w:type="dxa" w:w="1701"/>
+            <w:shd w:val="clear" w:fill="f1f5f9"/>
+          </w:tcPr>
+          <w:p>
+            <w:r/>
+            <w:r>
+              <w:rPr>
+                <w:color w:val="1E293B"/>
+                <w:sz w:val="19"/>
+              </w:rPr>
+              <w:t>Agendamentos</w:t>
+            </w:r>
+          </w:p>
+        </w:tc>
+        <w:tc>
+          <w:tcPr>
+            <w:tcW w:type="dxa" w:w="850"/>
+            <w:shd w:val="clear" w:fill="f1f5f9"/>
+          </w:tcPr>
+          <w:p>
+            <w:r/>
+            <w:r>
+              <w:rPr>
+                <w:color w:val="1E293B"/>
+                <w:sz w:val="19"/>
+              </w:rPr>
+              <w:t>6</w:t>
+            </w:r>
+          </w:p>
+        </w:tc>
+        <w:tc>
+          <w:tcPr>
+            <w:tcW w:type="dxa" w:w="4819"/>
+            <w:shd w:val="clear" w:fill="f1f5f9"/>
+          </w:tcPr>
+          <w:p>
+            <w:r/>
+            <w:r>
+              <w:rPr>
+                <w:color w:val="1E293B"/>
+                <w:sz w:val="19"/>
+              </w:rPr>
+              <w:t>Double-booking: dois agendamentos concorrentes</w:t>
+              <w:br/>
+              <w:t>para o mesmo médico/horário eram ambos aceitos</w:t>
+            </w:r>
+          </w:p>
+        </w:tc>
+        <w:tc>
+          <w:tcPr>
+            <w:tcW w:type="dxa" w:w="2268"/>
+            <w:shd w:val="clear" w:fill="f1f5f9"/>
+          </w:tcPr>
+          <w:p>
+            <w:r/>
+            <w:r>
+              <w:rPr>
+                <w:color w:val="1E293B"/>
+                <w:sz w:val="19"/>
+              </w:rPr>
+              <w:t>sgsm + sgsm-front-medico</w:t>
+            </w:r>
+          </w:p>
+        </w:tc>
+      </w:tr>
+      <w:tr>
+        <w:tc>
+          <w:tcPr>
+            <w:tcW w:type="dxa" w:w="1701"/>
+          </w:tcPr>
+          <w:p>
+            <w:r/>
+            <w:r>
+              <w:rPr>
+                <w:color w:val="1E293B"/>
+                <w:sz w:val="19"/>
+              </w:rPr>
+              <w:t>Resetar Senha</w:t>
+            </w:r>
+          </w:p>
+        </w:tc>
+        <w:tc>
+          <w:tcPr>
+            <w:tcW w:type="dxa" w:w="850"/>
+          </w:tcPr>
+          <w:p>
+            <w:r/>
+            <w:r>
+              <w:rPr>
+                <w:color w:val="1E293B"/>
+                <w:sz w:val="19"/>
+              </w:rPr>
+              <w:t>2</w:t>
+            </w:r>
+          </w:p>
+        </w:tc>
+        <w:tc>
+          <w:tcPr>
+            <w:tcW w:type="dxa" w:w="4819"/>
+          </w:tcPr>
+          <w:p>
+            <w:r/>
+            <w:r>
+              <w:rPr>
+                <w:color w:val="1E293B"/>
+                <w:sz w:val="19"/>
+              </w:rPr>
+              <w:t>Token de reset inválido/expirado retornava 401,</w:t>
+              <w:br/>
+              <w:t>confundido pelo interceptor com sessão expirada</w:t>
+              <w:br/>
+              <w:t>e redirecionando o usuário anônimo para /login</w:t>
+              <w:br/>
+              <w:t>sem mostrar o erro real</w:t>
+            </w:r>
+          </w:p>
+        </w:tc>
+        <w:tc>
+          <w:tcPr>
+            <w:tcW w:type="dxa" w:w="2268"/>
+          </w:tcPr>
+          <w:p>
+            <w:r/>
+            <w:r>
+              <w:rPr>
+                <w:color w:val="1E293B"/>
+                <w:sz w:val="19"/>
+              </w:rPr>
+              <w:t>ms-sboot-auth + sgsm-front-medico</w:t>
+            </w:r>
+          </w:p>
+        </w:tc>
+      </w:tr>
+      <w:tr>
+        <w:tc>
+          <w:tcPr>
+            <w:tcW w:type="dxa" w:w="1701"/>
+            <w:shd w:val="clear" w:fill="f1f5f9"/>
+          </w:tcPr>
+          <w:p>
+            <w:r/>
+            <w:r>
+              <w:rPr>
+                <w:color w:val="1E293B"/>
+                <w:sz w:val="19"/>
+              </w:rPr>
+              <w:t>Registrar</w:t>
+            </w:r>
+          </w:p>
+        </w:tc>
+        <w:tc>
+          <w:tcPr>
+            <w:tcW w:type="dxa" w:w="850"/>
+            <w:shd w:val="clear" w:fill="f1f5f9"/>
+          </w:tcPr>
+          <w:p>
+            <w:r/>
+            <w:r>
+              <w:rPr>
+                <w:color w:val="1E293B"/>
+                <w:sz w:val="19"/>
+              </w:rPr>
+              <w:t>4</w:t>
+            </w:r>
+          </w:p>
+        </w:tc>
+        <w:tc>
+          <w:tcPr>
+            <w:tcW w:type="dxa" w:w="4819"/>
+            <w:shd w:val="clear" w:fill="f1f5f9"/>
+          </w:tcPr>
+          <w:p>
+            <w:r/>
+            <w:r>
+              <w:rPr>
+                <w:color w:val="1E293B"/>
+                <w:sz w:val="19"/>
+              </w:rPr>
+              <w:t>Cadastro de médico/paciente ficava órfão (sem</w:t>
+              <w:br/>
+              <w:t>conta de login) quando o e-mail já estava em uso</w:t>
+              <w:br/>
+              <w:t>por outro perfil</w:t>
+            </w:r>
+          </w:p>
+        </w:tc>
+        <w:tc>
+          <w:tcPr>
+            <w:tcW w:type="dxa" w:w="2268"/>
+            <w:shd w:val="clear" w:fill="f1f5f9"/>
+          </w:tcPr>
+          <w:p>
+            <w:r/>
+            <w:r>
+              <w:rPr>
+                <w:color w:val="1E293B"/>
+                <w:sz w:val="19"/>
+              </w:rPr>
+              <w:t>sgsm + ms-sboot-auth + sgsm-front-medico</w:t>
+            </w:r>
+          </w:p>
+        </w:tc>
+      </w:tr>
+    </w:tbl>
+    <w:p>
+      <w:pPr>
+        <w:spacing w:after="80"/>
+      </w:pPr>
+    </w:p>
+    <w:p>
+      <w:pPr>
+        <w:spacing w:before="80" w:after="200"/>
+      </w:pPr>
+      <w:r>
+        <w:rPr>
+          <w:i/>
+          <w:color w:val="15803D"/>
+          <w:sz w:val="20"/>
+        </w:rPr>
+        <w:t>Total: 15 bugs encontrados e corrigidos nesta rodada, mais os 5 já corrigidos do qa/medicos (seção anterior) — 20 bugs de backend/front-end corrigidos ao longo de todo o ciclo de QA funcional.</w:t>
+      </w:r>
+    </w:p>
+    <w:p>
+      <w:pPr>
+        <w:spacing w:before="400" w:after="160"/>
+        <w:pBdr>
+          <w:bottom w:val="single" w:sz="6" w:space="4" w:color="1a56db"/>
+        </w:pBdr>
+      </w:pPr>
+      <w:r>
+        <w:rPr>
+          <w:b/>
+          <w:color w:val="1A56DB"/>
+          <w:sz w:val="30"/>
+        </w:rPr>
         <w:t>Observações e recomendações</w:t>
       </w:r>
     </w:p>
@@ -1518,7 +2056,7 @@
           <w:color w:val="1E293B"/>
           <w:sz w:val="21"/>
         </w:rPr>
-        <w:t>O fluxo completo de autenticação (login, registro, esqueci/resetar senha) nunca passou por QA funcional dedicada — é o maior risco identificado, por ser a porta de entrada de todo o sistema.</w:t>
+        <w:t>Restam apenas 4 telas sem QA funcional: HomePage, WorldPage, LoginPage e IaPage. LoginPage é agora o maior risco isolado, por ser a porta de entrada do sistema — os fluxos vizinhos (/registrar, /esqueci-senha, /resetar-senha) já foram cobertos nesta rodada.</w:t>
       </w:r>
     </w:p>
     <w:p>
@@ -1532,7 +2070,7 @@
           <w:color w:val="1E293B"/>
           <w:sz w:val="21"/>
         </w:rPr>
-        <w:t>Agendamentos é provavelmente o módulo mais crítico ainda sem cobertura, por envolver agenda médica, horários e conflitos de marcação.</w:t>
+        <w:t>Das 9 telas já testadas, todas as correções de bug identificadas foram aplicadas e mergeadas em develop — não há PR pendente de nenhuma das QAs concluídas até o momento deste relatório.</w:t>
       </w:r>
     </w:p>
     <w:p>
@@ -1546,21 +2084,7 @@
           <w:color w:val="1E293B"/>
           <w:sz w:val="21"/>
         </w:rPr>
-        <w:t>qa/servico-medico foi mergiada na develop (PR #19) — os 5 módulos com QA funcional executada (Pacientes, Médicos, Estabelecimentos, CRM, Serviços) estão todos na develop.</w:t>
-      </w:r>
-    </w:p>
-    <w:p>
-      <w:pPr>
-        <w:pStyle w:val="ListBullet"/>
-        <w:spacing w:after="80"/>
-        <w:ind w:left="283"/>
-      </w:pPr>
-      <w:r>
-        <w:rPr>
-          <w:color w:val="1E293B"/>
-          <w:sz w:val="21"/>
-        </w:rPr>
-        <w:t>A tela de Médicos (qa/medicos) foi mergiada diretamente na develop, sem passar por Pull Request no GitHub — fora do padrão observado nas demais QAs.</w:t>
+        <w:t>A tela de Médicos (qa/medicos) continua sendo a única mergeada diretamente em develop sem passar por Pull Request no GitHub — fora do padrão observado em todas as demais QAs, incluindo as 4 mais recentes.</w:t>
       </w:r>
     </w:p>
     <w:p>
@@ -1575,6 +2099,20 @@
           <w:sz w:val="21"/>
         </w:rPr>
         <w:t>Os bugs de backend do qa/medicos (M15, M16, M18, M55, M54) já foram todos corrigidos e mergiados — ver seção dedicada acima. O achado de Serviços (limpar Duração em edição não persiste) segue como limitação conhecida e deliberadamente não corrigida, por ser convenção global do backend (ModelMapper Conditions.isNotNull()) que afeta todos os endpoints de update do sistema, não só Serviços.</w:t>
+      </w:r>
+    </w:p>
+    <w:p>
+      <w:pPr>
+        <w:pStyle w:val="ListBullet"/>
+        <w:spacing w:after="80"/>
+        <w:ind w:left="283"/>
+      </w:pPr>
+      <w:r>
+        <w:rPr>
+          <w:color w:val="1E293B"/>
+          <w:sz w:val="21"/>
+        </w:rPr>
+        <w:t>A instalação e autenticação do GitHub CLI (gh) nesta sessão permitiu abrir e mergear os 9 PRs da rodada de 20/08 diretamente por linha de comando — ver relatorio-prs-pendentes-2026-08-20.docx para o detalhe completo do processo.</w:t>
       </w:r>
     </w:p>
     <w:p>

</xml_diff>